<commit_message>
Sync to upstream se-27 (SHA: cde5bf7261a7d8e491ed55e1383029d804d5e202)
</commit_message>
<xml_diff>
--- a/Base Application/Sales/Document/StandardSalesQuote.docx
+++ b/Base Application/Sales/Document/StandardSalesQuote.docx
@@ -45,7 +45,7 @@
                 <w:placeholder>
                   <w:docPart w:val="18ECDB4E735444248662DE2B13ECDE27"/>
                 </w:placeholder>
-                <w:dataBinding w:prefixMappings="xmlns:ns0='urn:microsoft-dynamics-nav/reports/Standard_Sales_Quote/1304/'" w:xpath="/ns0:NavWordReportXmlPart[1]/ns0:Header[1]/ns0:CustomerAddress1[1]" w:storeItemID="{7E128FEB-D125-49A8-BA06-DC921CECAB22}"/>
+                <w:dataBinding w:prefixMappings="xmlns:ns0='urn:microsoft-dynamics-nav/reports/Standard_Sales_Quote/1304/'" w:xpath="/ns0:NavWordReportXmlPart[1]/ns0:Header[1]/ns0:CustomerAddress1[1]" w:storeItemID="{12A2964D-3EB4-4B1E-8949-A99CA3D19D26}"/>
                 <w:text/>
               </w:sdtPr>
               <w:sdtEndPr>
@@ -83,7 +83,7 @@
                 <w:placeholder>
                   <w:docPart w:val="59F3843398E743F4AC86CE600F56C9F9"/>
                 </w:placeholder>
-                <w:dataBinding w:prefixMappings="xmlns:ns0='urn:microsoft-dynamics-nav/reports/Standard_Sales_Quote/1304/'" w:xpath="/ns0:NavWordReportXmlPart[1]/ns0:Header[1]/ns0:CompanyAddress1[1]" w:storeItemID="{7E128FEB-D125-49A8-BA06-DC921CECAB22}"/>
+                <w:dataBinding w:prefixMappings="xmlns:ns0='urn:microsoft-dynamics-nav/reports/Standard_Sales_Quote/1304/'" w:xpath="/ns0:NavWordReportXmlPart[1]/ns0:Header[1]/ns0:CompanyAddress1[1]" w:storeItemID="{12A2964D-3EB4-4B1E-8949-A99CA3D19D26}"/>
                 <w:text/>
               </w:sdtPr>
               <w:sdtContent>
@@ -112,7 +112,7 @@
                 <w:placeholder>
                   <w:docPart w:val="2F34EED7068C4D88AF02DA5EDCEF4F77"/>
                 </w:placeholder>
-                <w:dataBinding w:prefixMappings="xmlns:ns0='urn:microsoft-dynamics-nav/reports/Standard_Sales_Quote/1304/'" w:xpath="/ns0:NavWordReportXmlPart[1]/ns0:Header[1]/ns0:CustomerAddress2[1]" w:storeItemID="{7E128FEB-D125-49A8-BA06-DC921CECAB22}"/>
+                <w:dataBinding w:prefixMappings="xmlns:ns0='urn:microsoft-dynamics-nav/reports/Standard_Sales_Quote/1304/'" w:xpath="/ns0:NavWordReportXmlPart[1]/ns0:Header[1]/ns0:CustomerAddress2[1]" w:storeItemID="{12A2964D-3EB4-4B1E-8949-A99CA3D19D26}"/>
                 <w:text/>
               </w:sdtPr>
               <w:sdtContent>
@@ -140,7 +140,7 @@
                 <w:placeholder>
                   <w:docPart w:val="B9A829857B8F42CCA7AF65F5DA104A42"/>
                 </w:placeholder>
-                <w:dataBinding w:prefixMappings="xmlns:ns0='urn:microsoft-dynamics-nav/reports/Standard_Sales_Quote/1304/'" w:xpath="/ns0:NavWordReportXmlPart[1]/ns0:Header[1]/ns0:CompanyAddress2[1]" w:storeItemID="{7E128FEB-D125-49A8-BA06-DC921CECAB22}"/>
+                <w:dataBinding w:prefixMappings="xmlns:ns0='urn:microsoft-dynamics-nav/reports/Standard_Sales_Quote/1304/'" w:xpath="/ns0:NavWordReportXmlPart[1]/ns0:Header[1]/ns0:CompanyAddress2[1]" w:storeItemID="{12A2964D-3EB4-4B1E-8949-A99CA3D19D26}"/>
                 <w:text/>
               </w:sdtPr>
               <w:sdtContent>
@@ -169,7 +169,7 @@
                 <w:placeholder>
                   <w:docPart w:val="B558D5F557424E7580F2C33A7245551E"/>
                 </w:placeholder>
-                <w:dataBinding w:prefixMappings="xmlns:ns0='urn:microsoft-dynamics-nav/reports/Standard_Sales_Quote/1304/'" w:xpath="/ns0:NavWordReportXmlPart[1]/ns0:Header[1]/ns0:CustomerAddress3[1]" w:storeItemID="{7E128FEB-D125-49A8-BA06-DC921CECAB22}"/>
+                <w:dataBinding w:prefixMappings="xmlns:ns0='urn:microsoft-dynamics-nav/reports/Standard_Sales_Quote/1304/'" w:xpath="/ns0:NavWordReportXmlPart[1]/ns0:Header[1]/ns0:CustomerAddress3[1]" w:storeItemID="{12A2964D-3EB4-4B1E-8949-A99CA3D19D26}"/>
                 <w:text/>
               </w:sdtPr>
               <w:sdtContent>
@@ -197,7 +197,7 @@
                 <w:placeholder>
                   <w:docPart w:val="EFC0FD1BB77C414CAEADE5BC3F86D0EF"/>
                 </w:placeholder>
-                <w:dataBinding w:prefixMappings="xmlns:ns0='urn:microsoft-dynamics-nav/reports/Standard_Sales_Quote/1304/'" w:xpath="/ns0:NavWordReportXmlPart[1]/ns0:Header[1]/ns0:CompanyAddress3[1]" w:storeItemID="{7E128FEB-D125-49A8-BA06-DC921CECAB22}"/>
+                <w:dataBinding w:prefixMappings="xmlns:ns0='urn:microsoft-dynamics-nav/reports/Standard_Sales_Quote/1304/'" w:xpath="/ns0:NavWordReportXmlPart[1]/ns0:Header[1]/ns0:CompanyAddress3[1]" w:storeItemID="{12A2964D-3EB4-4B1E-8949-A99CA3D19D26}"/>
                 <w:text/>
               </w:sdtPr>
               <w:sdtContent>
@@ -226,7 +226,7 @@
                 <w:placeholder>
                   <w:docPart w:val="18DDE567520A4EFC9378CCA4C87E4DDF"/>
                 </w:placeholder>
-                <w:dataBinding w:prefixMappings="xmlns:ns0='urn:microsoft-dynamics-nav/reports/Standard_Sales_Quote/1304/'" w:xpath="/ns0:NavWordReportXmlPart[1]/ns0:Header[1]/ns0:CustomerAddress4[1]" w:storeItemID="{7E128FEB-D125-49A8-BA06-DC921CECAB22}"/>
+                <w:dataBinding w:prefixMappings="xmlns:ns0='urn:microsoft-dynamics-nav/reports/Standard_Sales_Quote/1304/'" w:xpath="/ns0:NavWordReportXmlPart[1]/ns0:Header[1]/ns0:CustomerAddress4[1]" w:storeItemID="{12A2964D-3EB4-4B1E-8949-A99CA3D19D26}"/>
                 <w:text/>
               </w:sdtPr>
               <w:sdtContent>
@@ -254,7 +254,7 @@
                 <w:placeholder>
                   <w:docPart w:val="CF22DB901D5644609DBD9B606390CF97"/>
                 </w:placeholder>
-                <w:dataBinding w:prefixMappings="xmlns:ns0='urn:microsoft-dynamics-nav/reports/Standard_Sales_Quote/1304/'" w:xpath="/ns0:NavWordReportXmlPart[1]/ns0:Header[1]/ns0:CompanyAddress4[1]" w:storeItemID="{7E128FEB-D125-49A8-BA06-DC921CECAB22}"/>
+                <w:dataBinding w:prefixMappings="xmlns:ns0='urn:microsoft-dynamics-nav/reports/Standard_Sales_Quote/1304/'" w:xpath="/ns0:NavWordReportXmlPart[1]/ns0:Header[1]/ns0:CompanyAddress4[1]" w:storeItemID="{12A2964D-3EB4-4B1E-8949-A99CA3D19D26}"/>
                 <w:text/>
               </w:sdtPr>
               <w:sdtContent>
@@ -283,7 +283,7 @@
                 <w:placeholder>
                   <w:docPart w:val="1B3FC965A2AF4D7D8BB278817E8B0A34"/>
                 </w:placeholder>
-                <w:dataBinding w:prefixMappings="xmlns:ns0='urn:microsoft-dynamics-nav/reports/Standard_Sales_Quote/1304/'" w:xpath="/ns0:NavWordReportXmlPart[1]/ns0:Header[1]/ns0:CustomerAddress5[1]" w:storeItemID="{7E128FEB-D125-49A8-BA06-DC921CECAB22}"/>
+                <w:dataBinding w:prefixMappings="xmlns:ns0='urn:microsoft-dynamics-nav/reports/Standard_Sales_Quote/1304/'" w:xpath="/ns0:NavWordReportXmlPart[1]/ns0:Header[1]/ns0:CustomerAddress5[1]" w:storeItemID="{12A2964D-3EB4-4B1E-8949-A99CA3D19D26}"/>
                 <w:text/>
               </w:sdtPr>
               <w:sdtContent>
@@ -311,7 +311,7 @@
                 <w:placeholder>
                   <w:docPart w:val="EAAF8D4E278E4278AD200C0628BFB94B"/>
                 </w:placeholder>
-                <w:dataBinding w:prefixMappings="xmlns:ns0='urn:microsoft-dynamics-nav/reports/Standard_Sales_Quote/1304/'" w:xpath="/ns0:NavWordReportXmlPart[1]/ns0:Header[1]/ns0:CompanyAddress5[1]" w:storeItemID="{7E128FEB-D125-49A8-BA06-DC921CECAB22}"/>
+                <w:dataBinding w:prefixMappings="xmlns:ns0='urn:microsoft-dynamics-nav/reports/Standard_Sales_Quote/1304/'" w:xpath="/ns0:NavWordReportXmlPart[1]/ns0:Header[1]/ns0:CompanyAddress5[1]" w:storeItemID="{12A2964D-3EB4-4B1E-8949-A99CA3D19D26}"/>
                 <w:text/>
               </w:sdtPr>
               <w:sdtContent>
@@ -340,7 +340,7 @@
                 <w:placeholder>
                   <w:docPart w:val="E3734E30A5ED4EC1980236FEB539BEAC"/>
                 </w:placeholder>
-                <w:dataBinding w:prefixMappings="xmlns:ns0='urn:microsoft-dynamics-nav/reports/Standard_Sales_Quote/1304/'" w:xpath="/ns0:NavWordReportXmlPart[1]/ns0:Header[1]/ns0:CustomerAddress6[1]" w:storeItemID="{7E128FEB-D125-49A8-BA06-DC921CECAB22}"/>
+                <w:dataBinding w:prefixMappings="xmlns:ns0='urn:microsoft-dynamics-nav/reports/Standard_Sales_Quote/1304/'" w:xpath="/ns0:NavWordReportXmlPart[1]/ns0:Header[1]/ns0:CustomerAddress6[1]" w:storeItemID="{12A2964D-3EB4-4B1E-8949-A99CA3D19D26}"/>
                 <w:text/>
               </w:sdtPr>
               <w:sdtContent>
@@ -368,7 +368,7 @@
                 <w:placeholder>
                   <w:docPart w:val="4C7CBF38C5EA4C6E88B82768E56F4463"/>
                 </w:placeholder>
-                <w:dataBinding w:prefixMappings="xmlns:ns0='urn:microsoft-dynamics-nav/reports/Standard_Sales_Quote/1304/'" w:xpath="/ns0:NavWordReportXmlPart[1]/ns0:Header[1]/ns0:CompanyAddress6[1]" w:storeItemID="{7E128FEB-D125-49A8-BA06-DC921CECAB22}"/>
+                <w:dataBinding w:prefixMappings="xmlns:ns0='urn:microsoft-dynamics-nav/reports/Standard_Sales_Quote/1304/'" w:xpath="/ns0:NavWordReportXmlPart[1]/ns0:Header[1]/ns0:CompanyAddress6[1]" w:storeItemID="{12A2964D-3EB4-4B1E-8949-A99CA3D19D26}"/>
                 <w:text/>
               </w:sdtPr>
               <w:sdtContent>
@@ -397,7 +397,7 @@
                 <w:placeholder>
                   <w:docPart w:val="6D50E62DE5704DC3A5636FDAAA73CCBA"/>
                 </w:placeholder>
-                <w:dataBinding w:prefixMappings="xmlns:ns0='urn:microsoft-dynamics-nav/reports/Standard_Sales_Quote/1304/'" w:xpath="/ns0:NavWordReportXmlPart[1]/ns0:Header[1]/ns0:CustomerAddress7[1]" w:storeItemID="{7E128FEB-D125-49A8-BA06-DC921CECAB22}"/>
+                <w:dataBinding w:prefixMappings="xmlns:ns0='urn:microsoft-dynamics-nav/reports/Standard_Sales_Quote/1304/'" w:xpath="/ns0:NavWordReportXmlPart[1]/ns0:Header[1]/ns0:CustomerAddress7[1]" w:storeItemID="{12A2964D-3EB4-4B1E-8949-A99CA3D19D26}"/>
                 <w:text/>
               </w:sdtPr>
               <w:sdtContent>
@@ -428,7 +428,7 @@
                 <w:placeholder>
                   <w:docPart w:val="572342047EEA4A598B011F25F5498032"/>
                 </w:placeholder>
-                <w:dataBinding w:prefixMappings="xmlns:ns0='urn:microsoft-dynamics-nav/reports/Standard_Sales_Quote/1304/'" w:xpath="/ns0:NavWordReportXmlPart[1]/ns0:Header[1]/ns0:CompanyLegalOffice_Lbl[1]" w:storeItemID="{7E128FEB-D125-49A8-BA06-DC921CECAB22}"/>
+                <w:dataBinding w:prefixMappings="xmlns:ns0='urn:microsoft-dynamics-nav/reports/Standard_Sales_Quote/1304/'" w:xpath="/ns0:NavWordReportXmlPart[1]/ns0:Header[1]/ns0:CompanyLegalOffice_Lbl[1]" w:storeItemID="{12A2964D-3EB4-4B1E-8949-A99CA3D19D26}"/>
                 <w:text/>
               </w:sdtPr>
               <w:sdtContent>
@@ -451,7 +451,7 @@
                 <w:placeholder>
                   <w:docPart w:val="B2398CECCE1A4AD1A81E04EF7E0CEA7E"/>
                 </w:placeholder>
-                <w:dataBinding w:prefixMappings="xmlns:ns0='urn:microsoft-dynamics-nav/reports/Standard_Sales_Quote/1304/'" w:xpath="/ns0:NavWordReportXmlPart[1]/ns0:Header[1]/ns0:CompanyLegalOffice[1]" w:storeItemID="{7E128FEB-D125-49A8-BA06-DC921CECAB22}"/>
+                <w:dataBinding w:prefixMappings="xmlns:ns0='urn:microsoft-dynamics-nav/reports/Standard_Sales_Quote/1304/'" w:xpath="/ns0:NavWordReportXmlPart[1]/ns0:Header[1]/ns0:CompanyLegalOffice[1]" w:storeItemID="{12A2964D-3EB4-4B1E-8949-A99CA3D19D26}"/>
                 <w:text/>
               </w:sdtPr>
               <w:sdtContent>
@@ -479,7 +479,7 @@
               <w:placeholder>
                 <w:docPart w:val="956CDC42C9E141AFAC9F698AFF0EFAC8"/>
               </w:placeholder>
-              <w:dataBinding w:prefixMappings="xmlns:ns0='urn:microsoft-dynamics-nav/reports/Standard_Sales_Quote/1304/'" w:xpath="/ns0:NavWordReportXmlPart[1]/ns0:Header[1]/ns0:CustomerAddress8[1]" w:storeItemID="{7E128FEB-D125-49A8-BA06-DC921CECAB22}"/>
+              <w:dataBinding w:prefixMappings="xmlns:ns0='urn:microsoft-dynamics-nav/reports/Standard_Sales_Quote/1304/'" w:xpath="/ns0:NavWordReportXmlPart[1]/ns0:Header[1]/ns0:CustomerAddress8[1]" w:storeItemID="{12A2964D-3EB4-4B1E-8949-A99CA3D19D26}"/>
               <w:text/>
             </w:sdtPr>
             <w:sdtContent>
@@ -550,7 +550,7 @@
             <w:placeholder>
               <w:docPart w:val="829C780A82D54599A9AEFB7B135ED0A0"/>
             </w:placeholder>
-            <w:dataBinding w:prefixMappings="xmlns:ns0='urn:microsoft-dynamics-nav/reports/Standard_Sales_Quote/1304/'" w:xpath="/ns0:NavWordReportXmlPart[1]/ns0:Header[1]/ns0:YourReference__Lbl[1]" w:storeItemID="{7E128FEB-D125-49A8-BA06-DC921CECAB22}"/>
+            <w:dataBinding w:prefixMappings="xmlns:ns0='urn:microsoft-dynamics-nav/reports/Standard_Sales_Quote/1304/'" w:xpath="/ns0:NavWordReportXmlPart[1]/ns0:Header[1]/ns0:YourReference__Lbl[1]" w:storeItemID="{12A2964D-3EB4-4B1E-8949-A99CA3D19D26}"/>
             <w:text/>
           </w:sdtPr>
           <w:sdtContent>
@@ -584,7 +584,7 @@
             <w:placeholder>
               <w:docPart w:val="DefaultPlaceholder_-1854013440"/>
             </w:placeholder>
-            <w:dataBinding w:prefixMappings="xmlns:ns0='urn:microsoft-dynamics-nav/reports/Standard_Sales_Quote/1304/'" w:xpath="/ns0:NavWordReportXmlPart[1]/ns0:Header[1]/ns0:QuoteValidToDate_Lbl[1]" w:storeItemID="{7E128FEB-D125-49A8-BA06-DC921CECAB22}"/>
+            <w:dataBinding w:prefixMappings="xmlns:ns0='urn:microsoft-dynamics-nav/reports/Standard_Sales_Quote/1304/'" w:xpath="/ns0:NavWordReportXmlPart[1]/ns0:Header[1]/ns0:QuoteValidToDate_Lbl[1]" w:storeItemID="{12A2964D-3EB4-4B1E-8949-A99CA3D19D26}"/>
             <w:text/>
           </w:sdtPr>
           <w:sdtContent>
@@ -625,7 +625,7 @@
             <w:placeholder>
               <w:docPart w:val="E0C5958E289F4EA6AEF3FF2D3A623991"/>
             </w:placeholder>
-            <w:dataBinding w:prefixMappings="xmlns:ns0='urn:microsoft-dynamics-nav/reports/Standard_Sales_Quote/1304/'" w:xpath="/ns0:NavWordReportXmlPart[1]/ns0:Header[1]/ns0:SalesPersonBlank_Lbl[1]" w:storeItemID="{7E128FEB-D125-49A8-BA06-DC921CECAB22}"/>
+            <w:dataBinding w:prefixMappings="xmlns:ns0='urn:microsoft-dynamics-nav/reports/Standard_Sales_Quote/1304/'" w:xpath="/ns0:NavWordReportXmlPart[1]/ns0:Header[1]/ns0:SalesPersonBlank_Lbl[1]" w:storeItemID="{12A2964D-3EB4-4B1E-8949-A99CA3D19D26}"/>
             <w:text/>
           </w:sdtPr>
           <w:sdtContent>
@@ -658,7 +658,7 @@
             <w:placeholder>
               <w:docPart w:val="BA20A71A9C2B4FC2894F4A35B4A19C83"/>
             </w:placeholder>
-            <w:dataBinding w:prefixMappings="xmlns:ns0='urn:microsoft-dynamics-nav/reports/Standard_Sales_Quote/1304/'" w:xpath="/ns0:NavWordReportXmlPart[1]/ns0:Header[1]/ns0:PaymentTermsDescription_Lbl[1]" w:storeItemID="{7E128FEB-D125-49A8-BA06-DC921CECAB22}"/>
+            <w:dataBinding w:prefixMappings="xmlns:ns0='urn:microsoft-dynamics-nav/reports/Standard_Sales_Quote/1304/'" w:xpath="/ns0:NavWordReportXmlPart[1]/ns0:Header[1]/ns0:PaymentTermsDescription_Lbl[1]" w:storeItemID="{12A2964D-3EB4-4B1E-8949-A99CA3D19D26}"/>
             <w:text/>
           </w:sdtPr>
           <w:sdtContent>
@@ -687,7 +687,7 @@
             <w:placeholder>
               <w:docPart w:val="8EBECE8351A6449480F4BD12D35DFD67"/>
             </w:placeholder>
-            <w:dataBinding w:prefixMappings="xmlns:ns0='urn:microsoft-dynamics-nav/reports/Standard_Sales_Quote/1304/'" w:xpath="/ns0:NavWordReportXmlPart[1]/ns0:Header[1]/ns0:ShipmentMethodDescription_Lbl[1]" w:storeItemID="{7E128FEB-D125-49A8-BA06-DC921CECAB22}"/>
+            <w:dataBinding w:prefixMappings="xmlns:ns0='urn:microsoft-dynamics-nav/reports/Standard_Sales_Quote/1304/'" w:xpath="/ns0:NavWordReportXmlPart[1]/ns0:Header[1]/ns0:ShipmentMethodDescription_Lbl[1]" w:storeItemID="{12A2964D-3EB4-4B1E-8949-A99CA3D19D26}"/>
             <w:text/>
           </w:sdtPr>
           <w:sdtContent>
@@ -726,7 +726,7 @@
                 <w:placeholder>
                   <w:docPart w:val="C66719FE3F7142DE9BE99D774F5857FE"/>
                 </w:placeholder>
-                <w:dataBinding w:prefixMappings="xmlns:ns0='urn:microsoft-dynamics-nav/reports/Standard_Sales_Quote/1304/'" w:xpath="/ns0:NavWordReportXmlPart[1]/ns0:Header[1]/ns0:YourReference[1]" w:storeItemID="{7E128FEB-D125-49A8-BA06-DC921CECAB22}"/>
+                <w:dataBinding w:prefixMappings="xmlns:ns0='urn:microsoft-dynamics-nav/reports/Standard_Sales_Quote/1304/'" w:xpath="/ns0:NavWordReportXmlPart[1]/ns0:Header[1]/ns0:YourReference[1]" w:storeItemID="{12A2964D-3EB4-4B1E-8949-A99CA3D19D26}"/>
                 <w:text/>
               </w:sdtPr>
               <w:sdtContent>
@@ -748,7 +748,7 @@
             <w:placeholder>
               <w:docPart w:val="DefaultPlaceholder_-1854013440"/>
             </w:placeholder>
-            <w:dataBinding w:prefixMappings="xmlns:ns0='urn:microsoft-dynamics-nav/reports/Standard_Sales_Quote/1304/'" w:xpath="/ns0:NavWordReportXmlPart[1]/ns0:Header[1]/ns0:QuoteValidToDate[1]" w:storeItemID="{7E128FEB-D125-49A8-BA06-DC921CECAB22}"/>
+            <w:dataBinding w:prefixMappings="xmlns:ns0='urn:microsoft-dynamics-nav/reports/Standard_Sales_Quote/1304/'" w:xpath="/ns0:NavWordReportXmlPart[1]/ns0:Header[1]/ns0:QuoteValidToDate[1]" w:storeItemID="{12A2964D-3EB4-4B1E-8949-A99CA3D19D26}"/>
             <w:text/>
           </w:sdtPr>
           <w:sdtContent>
@@ -774,7 +774,7 @@
             <w:placeholder>
               <w:docPart w:val="C201E33FE8E7497D9622F8E39C98775E"/>
             </w:placeholder>
-            <w:dataBinding w:prefixMappings="xmlns:ns0='urn:microsoft-dynamics-nav/reports/Standard_Sales_Quote/1304/'" w:xpath="/ns0:NavWordReportXmlPart[1]/ns0:Header[1]/ns0:SalesPersonName[1]" w:storeItemID="{7E128FEB-D125-49A8-BA06-DC921CECAB22}"/>
+            <w:dataBinding w:prefixMappings="xmlns:ns0='urn:microsoft-dynamics-nav/reports/Standard_Sales_Quote/1304/'" w:xpath="/ns0:NavWordReportXmlPart[1]/ns0:Header[1]/ns0:SalesPersonName[1]" w:storeItemID="{12A2964D-3EB4-4B1E-8949-A99CA3D19D26}"/>
             <w:text/>
           </w:sdtPr>
           <w:sdtContent>
@@ -801,7 +801,7 @@
             <w:placeholder>
               <w:docPart w:val="7371BF76BD59439582BCD043A6B514D0"/>
             </w:placeholder>
-            <w:dataBinding w:prefixMappings="xmlns:ns0='urn:microsoft-dynamics-nav/reports/Standard_Sales_Quote/1304/'" w:xpath="/ns0:NavWordReportXmlPart[1]/ns0:Header[1]/ns0:PaymentTermsDescription[1]" w:storeItemID="{7E128FEB-D125-49A8-BA06-DC921CECAB22}"/>
+            <w:dataBinding w:prefixMappings="xmlns:ns0='urn:microsoft-dynamics-nav/reports/Standard_Sales_Quote/1304/'" w:xpath="/ns0:NavWordReportXmlPart[1]/ns0:Header[1]/ns0:PaymentTermsDescription[1]" w:storeItemID="{12A2964D-3EB4-4B1E-8949-A99CA3D19D26}"/>
             <w:text/>
           </w:sdtPr>
           <w:sdtContent>
@@ -831,7 +831,7 @@
             <w:placeholder>
               <w:docPart w:val="A4855FA9D66342F7867385510C7771E2"/>
             </w:placeholder>
-            <w:dataBinding w:prefixMappings="xmlns:ns0='urn:microsoft-dynamics-nav/reports/Standard_Sales_Quote/1304/'" w:xpath="/ns0:NavWordReportXmlPart[1]/ns0:Header[1]/ns0:ShipmentMethodDescription[1]" w:storeItemID="{7E128FEB-D125-49A8-BA06-DC921CECAB22}"/>
+            <w:dataBinding w:prefixMappings="xmlns:ns0='urn:microsoft-dynamics-nav/reports/Standard_Sales_Quote/1304/'" w:xpath="/ns0:NavWordReportXmlPart[1]/ns0:Header[1]/ns0:ShipmentMethodDescription[1]" w:storeItemID="{12A2964D-3EB4-4B1E-8949-A99CA3D19D26}"/>
             <w:text/>
           </w:sdtPr>
           <w:sdtContent>
@@ -860,7 +860,7 @@
         <w:alias w:val="#Nav: /Header/WorkDescriptionLines"/>
         <w:tag w:val="#Nav: Standard_Sales_Quote/1304"/>
         <w:id w:val="-156540891"/>
-        <w15:dataBinding w:prefixMappings="xmlns:ns0='urn:microsoft-dynamics-nav/reports/Standard_Sales_Quote/1304/' " w:xpath="/ns0:NavWordReportXmlPart[1]/ns0:Header[1]/ns0:WorkDescriptionLines" w:storeItemID="{7E128FEB-D125-49A8-BA06-DC921CECAB22}"/>
+        <w15:dataBinding w:prefixMappings="xmlns:ns0='urn:microsoft-dynamics-nav/reports/Standard_Sales_Quote/1304/' " w:xpath="/ns0:NavWordReportXmlPart[1]/ns0:Header[1]/ns0:WorkDescriptionLines" w:storeItemID="{12A2964D-3EB4-4B1E-8949-A99CA3D19D26}"/>
         <w15:repeatingSection/>
       </w:sdtPr>
       <w:sdtContent>
@@ -881,7 +881,7 @@
                 <w:placeholder>
                   <w:docPart w:val="DefaultPlaceholder_-1854013440"/>
                 </w:placeholder>
-                <w:dataBinding w:prefixMappings="xmlns:ns0='urn:microsoft-dynamics-nav/reports/Standard_Sales_Quote/1304/'" w:xpath="/ns0:NavWordReportXmlPart[1]/ns0:Header[1]/ns0:WorkDescriptionLines[1]/ns0:WorkDescriptionLine[1]" w:storeItemID="{7E128FEB-D125-49A8-BA06-DC921CECAB22}"/>
+                <w:dataBinding w:prefixMappings="xmlns:ns0='urn:microsoft-dynamics-nav/reports/Standard_Sales_Quote/1304/'" w:xpath="/ns0:NavWordReportXmlPart[1]/ns0:Header[1]/ns0:WorkDescriptionLines[1]/ns0:WorkDescriptionLine[1]" w:storeItemID="{12A2964D-3EB4-4B1E-8949-A99CA3D19D26}"/>
                 <w:text/>
               </w:sdtPr>
               <w:sdtContent>
@@ -950,7 +950,7 @@
             <w:placeholder>
               <w:docPart w:val="2E83E9F4BA244B06B4DB5D21636C1E0A"/>
             </w:placeholder>
-            <w:dataBinding w:prefixMappings="xmlns:ns0='urn:microsoft-dynamics-nav/reports/Standard_Sales_Quote/1304/'" w:xpath="/ns0:NavWordReportXmlPart[1]/ns0:Header[1]/ns0:Line[1]/ns0:ItemNo_Line_Lbl[1]" w:storeItemID="{7E128FEB-D125-49A8-BA06-DC921CECAB22}"/>
+            <w:dataBinding w:prefixMappings="xmlns:ns0='urn:microsoft-dynamics-nav/reports/Standard_Sales_Quote/1304/'" w:xpath="/ns0:NavWordReportXmlPart[1]/ns0:Header[1]/ns0:Line[1]/ns0:ItemNo_Line_Lbl[1]" w:storeItemID="{12A2964D-3EB4-4B1E-8949-A99CA3D19D26}"/>
             <w:text/>
           </w:sdtPr>
           <w:sdtContent>
@@ -983,7 +983,7 @@
             <w:placeholder>
               <w:docPart w:val="2E83E9F4BA244B06B4DB5D21636C1E0A"/>
             </w:placeholder>
-            <w:dataBinding w:prefixMappings="xmlns:ns0='urn:microsoft-dynamics-nav/reports/Standard_Sales_Quote/1304/'" w:xpath="/ns0:NavWordReportXmlPart[1]/ns0:Header[1]/ns0:Line[1]/ns0:Description_Line_Lbl[1]" w:storeItemID="{7E128FEB-D125-49A8-BA06-DC921CECAB22}"/>
+            <w:dataBinding w:prefixMappings="xmlns:ns0='urn:microsoft-dynamics-nav/reports/Standard_Sales_Quote/1304/'" w:xpath="/ns0:NavWordReportXmlPart[1]/ns0:Header[1]/ns0:Line[1]/ns0:Description_Line_Lbl[1]" w:storeItemID="{12A2964D-3EB4-4B1E-8949-A99CA3D19D26}"/>
             <w:text/>
           </w:sdtPr>
           <w:sdtContent>
@@ -1016,7 +1016,7 @@
             <w:placeholder>
               <w:docPart w:val="2E83E9F4BA244B06B4DB5D21636C1E0A"/>
             </w:placeholder>
-            <w:dataBinding w:prefixMappings="xmlns:ns0='urn:microsoft-dynamics-nav/reports/Standard_Sales_Quote/1304/'" w:xpath="/ns0:NavWordReportXmlPart[1]/ns0:Header[1]/ns0:Line[1]/ns0:Quantity_Line_Lbl[1]" w:storeItemID="{7E128FEB-D125-49A8-BA06-DC921CECAB22}"/>
+            <w:dataBinding w:prefixMappings="xmlns:ns0='urn:microsoft-dynamics-nav/reports/Standard_Sales_Quote/1304/'" w:xpath="/ns0:NavWordReportXmlPart[1]/ns0:Header[1]/ns0:Line[1]/ns0:Quantity_Line_Lbl[1]" w:storeItemID="{12A2964D-3EB4-4B1E-8949-A99CA3D19D26}"/>
             <w:text/>
           </w:sdtPr>
           <w:sdtContent>
@@ -1064,7 +1064,7 @@
             <w:placeholder>
               <w:docPart w:val="2E83E9F4BA244B06B4DB5D21636C1E0A"/>
             </w:placeholder>
-            <w:dataBinding w:prefixMappings="xmlns:ns0='urn:microsoft-dynamics-nav/reports/Standard_Sales_Quote/1304/'" w:xpath="/ns0:NavWordReportXmlPart[1]/ns0:Header[1]/ns0:Line[1]/ns0:UnitPrice_Lbl[1]" w:storeItemID="{7E128FEB-D125-49A8-BA06-DC921CECAB22}"/>
+            <w:dataBinding w:prefixMappings="xmlns:ns0='urn:microsoft-dynamics-nav/reports/Standard_Sales_Quote/1304/'" w:xpath="/ns0:NavWordReportXmlPart[1]/ns0:Header[1]/ns0:Line[1]/ns0:UnitPrice_Lbl[1]" w:storeItemID="{12A2964D-3EB4-4B1E-8949-A99CA3D19D26}"/>
             <w:text/>
           </w:sdtPr>
           <w:sdtContent>
@@ -1112,7 +1112,7 @@
             <w:placeholder>
               <w:docPart w:val="2E83E9F4BA244B06B4DB5D21636C1E0A"/>
             </w:placeholder>
-            <w:dataBinding w:prefixMappings="xmlns:ns0='urn:microsoft-dynamics-nav/reports/Standard_Sales_Quote/1304/'" w:xpath="/ns0:NavWordReportXmlPart[1]/ns0:Header[1]/ns0:Line[1]/ns0:VATPct_Line_Lbl[1]" w:storeItemID="{7E128FEB-D125-49A8-BA06-DC921CECAB22}"/>
+            <w:dataBinding w:prefixMappings="xmlns:ns0='urn:microsoft-dynamics-nav/reports/Standard_Sales_Quote/1304/'" w:xpath="/ns0:NavWordReportXmlPart[1]/ns0:Header[1]/ns0:Line[1]/ns0:VATPct_Line_Lbl[1]" w:storeItemID="{12A2964D-3EB4-4B1E-8949-A99CA3D19D26}"/>
             <w:text/>
           </w:sdtPr>
           <w:sdtContent>
@@ -1146,7 +1146,7 @@
             <w:placeholder>
               <w:docPart w:val="2E83E9F4BA244B06B4DB5D21636C1E0A"/>
             </w:placeholder>
-            <w:dataBinding w:prefixMappings="xmlns:ns0='urn:microsoft-dynamics-nav/reports/Standard_Sales_Quote/1304/'" w:xpath="/ns0:NavWordReportXmlPart[1]/ns0:Header[1]/ns0:Line[1]/ns0:LineAmount_Line_Lbl[1]" w:storeItemID="{7E128FEB-D125-49A8-BA06-DC921CECAB22}"/>
+            <w:dataBinding w:prefixMappings="xmlns:ns0='urn:microsoft-dynamics-nav/reports/Standard_Sales_Quote/1304/'" w:xpath="/ns0:NavWordReportXmlPart[1]/ns0:Header[1]/ns0:Line[1]/ns0:LineAmount_Line_Lbl[1]" w:storeItemID="{12A2964D-3EB4-4B1E-8949-A99CA3D19D26}"/>
             <w:text/>
           </w:sdtPr>
           <w:sdtContent>
@@ -1294,7 +1294,7 @@
           <w:alias w:val="#Nav: /Header/Line"/>
           <w:tag w:val="#Nav: Standard_Sales_Quote/1304"/>
           <w:id w:val="1327254768"/>
-          <w15:dataBinding w:prefixMappings="xmlns:ns0='urn:microsoft-dynamics-nav/reports/Standard_Sales_Quote/1304/' " w:xpath="/ns0:NavWordReportXmlPart[1]/ns0:Header[1]/ns0:Line" w:storeItemID="{7E128FEB-D125-49A8-BA06-DC921CECAB22}"/>
+          <w15:dataBinding w:prefixMappings="xmlns:ns0='urn:microsoft-dynamics-nav/reports/Standard_Sales_Quote/1304/' " w:xpath="/ns0:NavWordReportXmlPart[1]/ns0:Header[1]/ns0:Line" w:storeItemID="{12A2964D-3EB4-4B1E-8949-A99CA3D19D26}"/>
           <w15:repeatingSection/>
         </w:sdtPr>
         <w:sdtContent>
@@ -1320,7 +1320,7 @@
                     <w:placeholder>
                       <w:docPart w:val="DEB5D457638B4B3BADC17E5F83CD3BEA"/>
                     </w:placeholder>
-                    <w:dataBinding w:prefixMappings="xmlns:ns0='urn:microsoft-dynamics-nav/reports/Standard_Sales_Quote/1304/'" w:xpath="/ns0:NavWordReportXmlPart[1]/ns0:Header[1]/ns0:Line[1]/ns0:ItemNo_Line[1]" w:storeItemID="{7E128FEB-D125-49A8-BA06-DC921CECAB22}"/>
+                    <w:dataBinding w:prefixMappings="xmlns:ns0='urn:microsoft-dynamics-nav/reports/Standard_Sales_Quote/1304/'" w:xpath="/ns0:NavWordReportXmlPart[1]/ns0:Header[1]/ns0:Line[1]/ns0:ItemNo_Line[1]" w:storeItemID="{12A2964D-3EB4-4B1E-8949-A99CA3D19D26}"/>
                     <w:text/>
                   </w:sdtPr>
                   <w:sdtContent>
@@ -1346,7 +1346,7 @@
                     <w:placeholder>
                       <w:docPart w:val="02FCF6F021E849649C78D8D7580E8391"/>
                     </w:placeholder>
-                    <w:dataBinding w:prefixMappings="xmlns:ns0='urn:microsoft-dynamics-nav/reports/Standard_Sales_Quote/1304/'" w:xpath="/ns0:NavWordReportXmlPart[1]/ns0:Header[1]/ns0:Line[1]/ns0:Description_Line[1]" w:storeItemID="{7E128FEB-D125-49A8-BA06-DC921CECAB22}"/>
+                    <w:dataBinding w:prefixMappings="xmlns:ns0='urn:microsoft-dynamics-nav/reports/Standard_Sales_Quote/1304/'" w:xpath="/ns0:NavWordReportXmlPart[1]/ns0:Header[1]/ns0:Line[1]/ns0:Description_Line[1]" w:storeItemID="{12A2964D-3EB4-4B1E-8949-A99CA3D19D26}"/>
                     <w:text/>
                   </w:sdtPr>
                   <w:sdtContent>
@@ -1380,7 +1380,7 @@
                         <w:placeholder>
                           <w:docPart w:val="1C4445099D0747588FD8AE93C1DFA82F"/>
                         </w:placeholder>
-                        <w:dataBinding w:prefixMappings="xmlns:ns0='urn:microsoft-dynamics-nav/reports/Standard_Sales_Quote/1304/'" w:xpath="/ns0:NavWordReportXmlPart[1]/ns0:Header[1]/ns0:Line[1]/ns0:Quantity_Line[1]" w:storeItemID="{7E128FEB-D125-49A8-BA06-DC921CECAB22}"/>
+                        <w:dataBinding w:prefixMappings="xmlns:ns0='urn:microsoft-dynamics-nav/reports/Standard_Sales_Quote/1304/'" w:xpath="/ns0:NavWordReportXmlPart[1]/ns0:Header[1]/ns0:Line[1]/ns0:Quantity_Line[1]" w:storeItemID="{12A2964D-3EB4-4B1E-8949-A99CA3D19D26}"/>
                         <w:text/>
                       </w:sdtPr>
                       <w:sdtContent>
@@ -1404,7 +1404,7 @@
                     <w:placeholder>
                       <w:docPart w:val="6D6A3BA876A641639F7A526F3BFAFBB0"/>
                     </w:placeholder>
-                    <w:dataBinding w:prefixMappings="xmlns:ns0='urn:microsoft-dynamics-nav/reports/Standard_Sales_Quote/1304/'" w:xpath="/ns0:NavWordReportXmlPart[1]/ns0:Header[1]/ns0:Line[1]/ns0:UnitOfMeasure[1]" w:storeItemID="{7E128FEB-D125-49A8-BA06-DC921CECAB22}"/>
+                    <w:dataBinding w:prefixMappings="xmlns:ns0='urn:microsoft-dynamics-nav/reports/Standard_Sales_Quote/1304/'" w:xpath="/ns0:NavWordReportXmlPart[1]/ns0:Header[1]/ns0:Line[1]/ns0:UnitOfMeasure[1]" w:storeItemID="{12A2964D-3EB4-4B1E-8949-A99CA3D19D26}"/>
                     <w:text/>
                   </w:sdtPr>
                   <w:sdtContent>
@@ -1430,7 +1430,7 @@
                     <w:placeholder>
                       <w:docPart w:val="EACE6141740F4759B8BAA80F2436F018"/>
                     </w:placeholder>
-                    <w:dataBinding w:prefixMappings="xmlns:ns0='urn:microsoft-dynamics-nav/reports/Standard_Sales_Quote/1304/'" w:xpath="/ns0:NavWordReportXmlPart[1]/ns0:Header[1]/ns0:Line[1]/ns0:UnitPrice[1]" w:storeItemID="{7E128FEB-D125-49A8-BA06-DC921CECAB22}"/>
+                    <w:dataBinding w:prefixMappings="xmlns:ns0='urn:microsoft-dynamics-nav/reports/Standard_Sales_Quote/1304/'" w:xpath="/ns0:NavWordReportXmlPart[1]/ns0:Header[1]/ns0:Line[1]/ns0:UnitPrice[1]" w:storeItemID="{12A2964D-3EB4-4B1E-8949-A99CA3D19D26}"/>
                     <w:text/>
                   </w:sdtPr>
                   <w:sdtContent>
@@ -1459,7 +1459,7 @@
                     <w:placeholder>
                       <w:docPart w:val="244D1BD89CCD442AB7CB0E4058E2F3C1"/>
                     </w:placeholder>
-                    <w:dataBinding w:prefixMappings="xmlns:ns0='urn:microsoft-dynamics-nav/reports/Standard_Sales_Quote/1304/'" w:xpath="/ns0:NavWordReportXmlPart[1]/ns0:Header[1]/ns0:Line[1]/ns0:LineDiscountPercentText_Line[1]" w:storeItemID="{7E128FEB-D125-49A8-BA06-DC921CECAB22}"/>
+                    <w:dataBinding w:prefixMappings="xmlns:ns0='urn:microsoft-dynamics-nav/reports/Standard_Sales_Quote/1304/'" w:xpath="/ns0:NavWordReportXmlPart[1]/ns0:Header[1]/ns0:Line[1]/ns0:LineDiscountPercentText_Line[1]" w:storeItemID="{12A2964D-3EB4-4B1E-8949-A99CA3D19D26}"/>
                     <w:text/>
                   </w:sdtPr>
                   <w:sdtContent>
@@ -1488,7 +1488,7 @@
                     <w:placeholder>
                       <w:docPart w:val="7694C953668D42F5930B18E0AA40B719"/>
                     </w:placeholder>
-                    <w:dataBinding w:prefixMappings="xmlns:ns0='urn:microsoft-dynamics-nav/reports/Standard_Sales_Quote/1304/'" w:xpath="/ns0:NavWordReportXmlPart[1]/ns0:Header[1]/ns0:Line[1]/ns0:VATPct_Line[1]" w:storeItemID="{7E128FEB-D125-49A8-BA06-DC921CECAB22}"/>
+                    <w:dataBinding w:prefixMappings="xmlns:ns0='urn:microsoft-dynamics-nav/reports/Standard_Sales_Quote/1304/'" w:xpath="/ns0:NavWordReportXmlPart[1]/ns0:Header[1]/ns0:Line[1]/ns0:VATPct_Line[1]" w:storeItemID="{12A2964D-3EB4-4B1E-8949-A99CA3D19D26}"/>
                     <w:text/>
                   </w:sdtPr>
                   <w:sdtContent>
@@ -1517,7 +1517,7 @@
                     <w:placeholder>
                       <w:docPart w:val="34B5636816334117AF7CC33826250A39"/>
                     </w:placeholder>
-                    <w:dataBinding w:prefixMappings="xmlns:ns0='urn:microsoft-dynamics-nav/reports/Standard_Sales_Quote/1304/'" w:xpath="/ns0:NavWordReportXmlPart[1]/ns0:Header[1]/ns0:Line[1]/ns0:LineAmount_Line[1]" w:storeItemID="{7E128FEB-D125-49A8-BA06-DC921CECAB22}"/>
+                    <w:dataBinding w:prefixMappings="xmlns:ns0='urn:microsoft-dynamics-nav/reports/Standard_Sales_Quote/1304/'" w:xpath="/ns0:NavWordReportXmlPart[1]/ns0:Header[1]/ns0:Line[1]/ns0:LineAmount_Line[1]" w:storeItemID="{12A2964D-3EB4-4B1E-8949-A99CA3D19D26}"/>
                     <w:text/>
                   </w:sdtPr>
                   <w:sdtContent>
@@ -1640,7 +1640,7 @@
           <w:alias w:val="#Nav: /Header/ReportTotalsLine"/>
           <w:tag w:val="#Nav: Standard_Sales_Quote/1304"/>
           <w:id w:val="1981810996"/>
-          <w15:dataBinding w:prefixMappings="xmlns:ns0='urn:microsoft-dynamics-nav/reports/Standard_Sales_Quote/1304/' " w:xpath="/ns0:NavWordReportXmlPart[1]/ns0:Header[1]/ns0:ReportTotalsLine" w:storeItemID="{7E128FEB-D125-49A8-BA06-DC921CECAB22}"/>
+          <w15:dataBinding w:prefixMappings="xmlns:ns0='urn:microsoft-dynamics-nav/reports/Standard_Sales_Quote/1304/' " w:xpath="/ns0:NavWordReportXmlPart[1]/ns0:Header[1]/ns0:ReportTotalsLine" w:storeItemID="{12A2964D-3EB4-4B1E-8949-A99CA3D19D26}"/>
           <w15:repeatingSection/>
         </w:sdtPr>
         <w:sdtContent>
@@ -1706,7 +1706,7 @@
                     <w:placeholder>
                       <w:docPart w:val="2E83E9F4BA244B06B4DB5D21636C1E0A"/>
                     </w:placeholder>
-                    <w:dataBinding w:prefixMappings="xmlns:ns0='urn:microsoft-dynamics-nav/reports/Standard_Sales_Quote/1304/'" w:xpath="/ns0:NavWordReportXmlPart[1]/ns0:Header[1]/ns0:ReportTotalsLine[1]/ns0:Description_ReportTotalsLine[1]" w:storeItemID="{7E128FEB-D125-49A8-BA06-DC921CECAB22}"/>
+                    <w:dataBinding w:prefixMappings="xmlns:ns0='urn:microsoft-dynamics-nav/reports/Standard_Sales_Quote/1304/'" w:xpath="/ns0:NavWordReportXmlPart[1]/ns0:Header[1]/ns0:ReportTotalsLine[1]/ns0:Description_ReportTotalsLine[1]" w:storeItemID="{12A2964D-3EB4-4B1E-8949-A99CA3D19D26}"/>
                     <w:text/>
                   </w:sdtPr>
                   <w:sdtContent>
@@ -1736,7 +1736,7 @@
                     <w:placeholder>
                       <w:docPart w:val="2E83E9F4BA244B06B4DB5D21636C1E0A"/>
                     </w:placeholder>
-                    <w:dataBinding w:prefixMappings="xmlns:ns0='urn:microsoft-dynamics-nav/reports/Standard_Sales_Quote/1304/'" w:xpath="/ns0:NavWordReportXmlPart[1]/ns0:Header[1]/ns0:ReportTotalsLine[1]/ns0:Amount_ReportTotalsLine[1]" w:storeItemID="{7E128FEB-D125-49A8-BA06-DC921CECAB22}"/>
+                    <w:dataBinding w:prefixMappings="xmlns:ns0='urn:microsoft-dynamics-nav/reports/Standard_Sales_Quote/1304/'" w:xpath="/ns0:NavWordReportXmlPart[1]/ns0:Header[1]/ns0:ReportTotalsLine[1]/ns0:Amount_ReportTotalsLine[1]" w:storeItemID="{12A2964D-3EB4-4B1E-8949-A99CA3D19D26}"/>
                     <w:text/>
                   </w:sdtPr>
                   <w:sdtContent>
@@ -1891,7 +1891,7 @@
             <w:placeholder>
               <w:docPart w:val="2E83E9F4BA244B06B4DB5D21636C1E0A"/>
             </w:placeholder>
-            <w:dataBinding w:prefixMappings="xmlns:ns0='urn:microsoft-dynamics-nav/reports/Standard_Sales_Quote/1304/'" w:xpath="/ns0:NavWordReportXmlPart[1]/ns0:Header[1]/ns0:Totals[1]/ns0:TotalIncludingVATText[1]" w:storeItemID="{7E128FEB-D125-49A8-BA06-DC921CECAB22}"/>
+            <w:dataBinding w:prefixMappings="xmlns:ns0='urn:microsoft-dynamics-nav/reports/Standard_Sales_Quote/1304/'" w:xpath="/ns0:NavWordReportXmlPart[1]/ns0:Header[1]/ns0:Totals[1]/ns0:TotalIncludingVATText[1]" w:storeItemID="{12A2964D-3EB4-4B1E-8949-A99CA3D19D26}"/>
             <w:text/>
           </w:sdtPr>
           <w:sdtContent>
@@ -1933,7 +1933,7 @@
             <w:placeholder>
               <w:docPart w:val="2E83E9F4BA244B06B4DB5D21636C1E0A"/>
             </w:placeholder>
-            <w:dataBinding w:prefixMappings="xmlns:ns0='urn:microsoft-dynamics-nav/reports/Standard_Sales_Quote/1304/'" w:xpath="/ns0:NavWordReportXmlPart[1]/ns0:Header[1]/ns0:Totals[1]/ns0:TotalAmountIncludingVAT[1]" w:storeItemID="{7E128FEB-D125-49A8-BA06-DC921CECAB22}"/>
+            <w:dataBinding w:prefixMappings="xmlns:ns0='urn:microsoft-dynamics-nav/reports/Standard_Sales_Quote/1304/'" w:xpath="/ns0:NavWordReportXmlPart[1]/ns0:Header[1]/ns0:Totals[1]/ns0:TotalAmountIncludingVAT[1]" w:storeItemID="{12A2964D-3EB4-4B1E-8949-A99CA3D19D26}"/>
             <w:text/>
           </w:sdtPr>
           <w:sdtContent>
@@ -2078,7 +2078,7 @@
             <w:placeholder>
               <w:docPart w:val="793055E079F94161B6DB65B71A1E06D9"/>
             </w:placeholder>
-            <w:dataBinding w:prefixMappings="xmlns:ns0='urn:microsoft-dynamics-nav/reports/Standard_Sales_Quote/1304/'" w:xpath="/ns0:NavWordReportXmlPart[1]/ns0:Header[1]/ns0:CompanyLegalStatement[1]" w:storeItemID="{7E128FEB-D125-49A8-BA06-DC921CECAB22}"/>
+            <w:dataBinding w:prefixMappings="xmlns:ns0='urn:microsoft-dynamics-nav/reports/Standard_Sales_Quote/1304/'" w:xpath="/ns0:NavWordReportXmlPart[1]/ns0:Header[1]/ns0:CompanyLegalStatement[1]" w:storeItemID="{12A2964D-3EB4-4B1E-8949-A99CA3D19D26}"/>
             <w:text/>
           </w:sdtPr>
           <w:sdtContent>
@@ -2165,7 +2165,7 @@
             <w:placeholder>
               <w:docPart w:val="11E91ADE68C44861BD08E0811A89194D"/>
             </w:placeholder>
-            <w:dataBinding w:prefixMappings="xmlns:ns0='urn:microsoft-dynamics-nav/reports/Standard_Sales_Quote/1304/'" w:xpath="/ns0:NavWordReportXmlPart[1]/ns0:Header[1]/ns0:CompanyLegalStatement[1]" w:storeItemID="{7E128FEB-D125-49A8-BA06-DC921CECAB22}"/>
+            <w:dataBinding w:prefixMappings="xmlns:ns0='urn:microsoft-dynamics-nav/reports/Standard_Sales_Quote/1304/'" w:xpath="/ns0:NavWordReportXmlPart[1]/ns0:Header[1]/ns0:CompanyLegalStatement[1]" w:storeItemID="{12A2964D-3EB4-4B1E-8949-A99CA3D19D26}"/>
             <w:text/>
           </w:sdtPr>
           <w:sdtContent>
@@ -2200,7 +2200,7 @@
           <w:placeholder>
             <w:docPart w:val="F60D021828DE440AB60A57F81B574D32"/>
           </w:placeholder>
-          <w:dataBinding w:prefixMappings="xmlns:ns0='urn:microsoft-dynamics-nav/reports/Standard_Sales_Quote/1304/'" w:xpath="/ns0:NavWordReportXmlPart[1]/ns0:Header[1]/ns0:CompanyVATRegistrationNo_Lbl[1]" w:storeItemID="{7E128FEB-D125-49A8-BA06-DC921CECAB22}"/>
+          <w:dataBinding w:prefixMappings="xmlns:ns0='urn:microsoft-dynamics-nav/reports/Standard_Sales_Quote/1304/'" w:xpath="/ns0:NavWordReportXmlPart[1]/ns0:Header[1]/ns0:CompanyVATRegistrationNo_Lbl[1]" w:storeItemID="{12A2964D-3EB4-4B1E-8949-A99CA3D19D26}"/>
           <w:text/>
         </w:sdtPr>
         <w:sdtContent>
@@ -2229,7 +2229,7 @@
           <w:placeholder>
             <w:docPart w:val="F60D021828DE440AB60A57F81B574D32"/>
           </w:placeholder>
-          <w:dataBinding w:prefixMappings="xmlns:ns0='urn:microsoft-dynamics-nav/reports/Standard_Sales_Quote/1304/'" w:xpath="/ns0:NavWordReportXmlPart[1]/ns0:Header[1]/ns0:HomePage_Lbl[1]" w:storeItemID="{7E128FEB-D125-49A8-BA06-DC921CECAB22}"/>
+          <w:dataBinding w:prefixMappings="xmlns:ns0='urn:microsoft-dynamics-nav/reports/Standard_Sales_Quote/1304/'" w:xpath="/ns0:NavWordReportXmlPart[1]/ns0:Header[1]/ns0:HomePage_Lbl[1]" w:storeItemID="{12A2964D-3EB4-4B1E-8949-A99CA3D19D26}"/>
           <w:text/>
         </w:sdtPr>
         <w:sdtContent>
@@ -2258,7 +2258,7 @@
           <w:placeholder>
             <w:docPart w:val="F60D021828DE440AB60A57F81B574D32"/>
           </w:placeholder>
-          <w:dataBinding w:prefixMappings="xmlns:ns0='urn:microsoft-dynamics-nav/reports/Standard_Sales_Quote/1304/'" w:xpath="/ns0:NavWordReportXmlPart[1]/ns0:Header[1]/ns0:CompanyPhoneNo_Lbl[1]" w:storeItemID="{7E128FEB-D125-49A8-BA06-DC921CECAB22}"/>
+          <w:dataBinding w:prefixMappings="xmlns:ns0='urn:microsoft-dynamics-nav/reports/Standard_Sales_Quote/1304/'" w:xpath="/ns0:NavWordReportXmlPart[1]/ns0:Header[1]/ns0:CompanyPhoneNo_Lbl[1]" w:storeItemID="{12A2964D-3EB4-4B1E-8949-A99CA3D19D26}"/>
           <w:text/>
         </w:sdtPr>
         <w:sdtContent>
@@ -2287,7 +2287,7 @@
           <w:placeholder>
             <w:docPart w:val="F60D021828DE440AB60A57F81B574D32"/>
           </w:placeholder>
-          <w:dataBinding w:prefixMappings="xmlns:ns0='urn:microsoft-dynamics-nav/reports/Standard_Sales_Quote/1304/'" w:xpath="/ns0:NavWordReportXmlPart[1]/ns0:Header[1]/ns0:EMail_Lbl[1]" w:storeItemID="{7E128FEB-D125-49A8-BA06-DC921CECAB22}"/>
+          <w:dataBinding w:prefixMappings="xmlns:ns0='urn:microsoft-dynamics-nav/reports/Standard_Sales_Quote/1304/'" w:xpath="/ns0:NavWordReportXmlPart[1]/ns0:Header[1]/ns0:EMail_Lbl[1]" w:storeItemID="{12A2964D-3EB4-4B1E-8949-A99CA3D19D26}"/>
           <w:text/>
         </w:sdtPr>
         <w:sdtContent>
@@ -2325,7 +2325,7 @@
           <w:placeholder>
             <w:docPart w:val="F60D021828DE440AB60A57F81B574D32"/>
           </w:placeholder>
-          <w:dataBinding w:prefixMappings="xmlns:ns0='urn:microsoft-dynamics-nav/reports/Standard_Sales_Quote/1304/'" w:xpath="/ns0:NavWordReportXmlPart[1]/ns0:Header[1]/ns0:CompanyVATRegistrationNo[1]" w:storeItemID="{7E128FEB-D125-49A8-BA06-DC921CECAB22}"/>
+          <w:dataBinding w:prefixMappings="xmlns:ns0='urn:microsoft-dynamics-nav/reports/Standard_Sales_Quote/1304/'" w:xpath="/ns0:NavWordReportXmlPart[1]/ns0:Header[1]/ns0:CompanyVATRegistrationNo[1]" w:storeItemID="{12A2964D-3EB4-4B1E-8949-A99CA3D19D26}"/>
           <w:text/>
         </w:sdtPr>
         <w:sdtContent>
@@ -2355,7 +2355,7 @@
           <w:placeholder>
             <w:docPart w:val="F60D021828DE440AB60A57F81B574D32"/>
           </w:placeholder>
-          <w:dataBinding w:prefixMappings="xmlns:ns0='urn:microsoft-dynamics-nav/reports/Standard_Sales_Quote/1304/'" w:xpath="/ns0:NavWordReportXmlPart[1]/ns0:Header[1]/ns0:CompanyHomePage[1]" w:storeItemID="{7E128FEB-D125-49A8-BA06-DC921CECAB22}"/>
+          <w:dataBinding w:prefixMappings="xmlns:ns0='urn:microsoft-dynamics-nav/reports/Standard_Sales_Quote/1304/'" w:xpath="/ns0:NavWordReportXmlPart[1]/ns0:Header[1]/ns0:CompanyHomePage[1]" w:storeItemID="{12A2964D-3EB4-4B1E-8949-A99CA3D19D26}"/>
           <w:text/>
         </w:sdtPr>
         <w:sdtContent>
@@ -2385,7 +2385,7 @@
           <w:placeholder>
             <w:docPart w:val="F60D021828DE440AB60A57F81B574D32"/>
           </w:placeholder>
-          <w:dataBinding w:prefixMappings="xmlns:ns0='urn:microsoft-dynamics-nav/reports/Standard_Sales_Quote/1304/'" w:xpath="/ns0:NavWordReportXmlPart[1]/ns0:Header[1]/ns0:CompanyPhoneNo[1]" w:storeItemID="{7E128FEB-D125-49A8-BA06-DC921CECAB22}"/>
+          <w:dataBinding w:prefixMappings="xmlns:ns0='urn:microsoft-dynamics-nav/reports/Standard_Sales_Quote/1304/'" w:xpath="/ns0:NavWordReportXmlPart[1]/ns0:Header[1]/ns0:CompanyPhoneNo[1]" w:storeItemID="{12A2964D-3EB4-4B1E-8949-A99CA3D19D26}"/>
           <w:text/>
         </w:sdtPr>
         <w:sdtContent>
@@ -2415,7 +2415,7 @@
           <w:placeholder>
             <w:docPart w:val="F60D021828DE440AB60A57F81B574D32"/>
           </w:placeholder>
-          <w:dataBinding w:prefixMappings="xmlns:ns0='urn:microsoft-dynamics-nav/reports/Standard_Sales_Quote/1304/'" w:xpath="/ns0:NavWordReportXmlPart[1]/ns0:Header[1]/ns0:CompanyEMail[1]" w:storeItemID="{7E128FEB-D125-49A8-BA06-DC921CECAB22}"/>
+          <w:dataBinding w:prefixMappings="xmlns:ns0='urn:microsoft-dynamics-nav/reports/Standard_Sales_Quote/1304/'" w:xpath="/ns0:NavWordReportXmlPart[1]/ns0:Header[1]/ns0:CompanyEMail[1]" w:storeItemID="{12A2964D-3EB4-4B1E-8949-A99CA3D19D26}"/>
           <w:text/>
         </w:sdtPr>
         <w:sdtContent>
@@ -2535,7 +2535,7 @@
               <w:placeholder>
                 <w:docPart w:val="C42934AA6A9C4AB7B7AFF124B2496D4D"/>
               </w:placeholder>
-              <w:dataBinding w:prefixMappings="xmlns:ns0='urn:microsoft-dynamics-nav/reports/Standard_Sales_Quote/1304/'" w:xpath="/ns0:NavWordReportXmlPart[1]/ns0:Header[1]/ns0:DocumentTitle_Lbl[1]" w:storeItemID="{7E128FEB-D125-49A8-BA06-DC921CECAB22}"/>
+              <w:dataBinding w:prefixMappings="xmlns:ns0='urn:microsoft-dynamics-nav/reports/Standard_Sales_Quote/1304/'" w:xpath="/ns0:NavWordReportXmlPart[1]/ns0:Header[1]/ns0:DocumentTitle_Lbl[1]" w:storeItemID="{12A2964D-3EB4-4B1E-8949-A99CA3D19D26}"/>
               <w:text/>
             </w:sdtPr>
             <w:sdtContent>
@@ -2566,7 +2566,7 @@
               <w:placeholder>
                 <w:docPart w:val="C42934AA6A9C4AB7B7AFF124B2496D4D"/>
               </w:placeholder>
-              <w:dataBinding w:prefixMappings="xmlns:ns0='urn:microsoft-dynamics-nav/reports/Standard_Sales_Quote/1304/'" w:xpath="/ns0:NavWordReportXmlPart[1]/ns0:Header[1]/ns0:DocumentNo[1]" w:storeItemID="{7E128FEB-D125-49A8-BA06-DC921CECAB22}"/>
+              <w:dataBinding w:prefixMappings="xmlns:ns0='urn:microsoft-dynamics-nav/reports/Standard_Sales_Quote/1304/'" w:xpath="/ns0:NavWordReportXmlPart[1]/ns0:Header[1]/ns0:DocumentNo[1]" w:storeItemID="{12A2964D-3EB4-4B1E-8949-A99CA3D19D26}"/>
               <w:text/>
             </w:sdtPr>
             <w:sdtContent>
@@ -2596,7 +2596,7 @@
               <w:placeholder>
                 <w:docPart w:val="63FC68B69B794CC0AF2B3027146DD849"/>
               </w:placeholder>
-              <w:dataBinding w:prefixMappings="xmlns:ns0='urn:microsoft-dynamics-nav/reports/Standard_Sales_Quote/1304/'" w:xpath="/ns0:NavWordReportXmlPart[1]/ns0:Header[1]/ns0:DocumentDate[1]" w:storeItemID="{7E128FEB-D125-49A8-BA06-DC921CECAB22}"/>
+              <w:dataBinding w:prefixMappings="xmlns:ns0='urn:microsoft-dynamics-nav/reports/Standard_Sales_Quote/1304/'" w:xpath="/ns0:NavWordReportXmlPart[1]/ns0:Header[1]/ns0:DocumentDate[1]" w:storeItemID="{12A2964D-3EB4-4B1E-8949-A99CA3D19D26}"/>
               <w:text/>
             </w:sdtPr>
             <w:sdtContent>
@@ -2626,7 +2626,7 @@
               <w:placeholder>
                 <w:docPart w:val="FF625D7257C44EA4BB61D91263F50DEA"/>
               </w:placeholder>
-              <w:dataBinding w:prefixMappings="xmlns:ns0='urn:microsoft-dynamics-nav/reports/Standard_Sales_Quote/1304/'" w:xpath="/ns0:NavWordReportXmlPart[1]/ns0:Header[1]/ns0:Page_Lbl[1]" w:storeItemID="{7E128FEB-D125-49A8-BA06-DC921CECAB22}"/>
+              <w:dataBinding w:prefixMappings="xmlns:ns0='urn:microsoft-dynamics-nav/reports/Standard_Sales_Quote/1304/'" w:xpath="/ns0:NavWordReportXmlPart[1]/ns0:Header[1]/ns0:Page_Lbl[1]" w:storeItemID="{12A2964D-3EB4-4B1E-8949-A99CA3D19D26}"/>
               <w:text/>
             </w:sdtPr>
             <w:sdtContent>
@@ -2779,7 +2779,7 @@
               <w:placeholder>
                 <w:docPart w:val="4BE75748E74141829A5BC447504D1AE2"/>
               </w:placeholder>
-              <w:dataBinding w:prefixMappings="xmlns:ns0='urn:microsoft-dynamics-nav/reports/Standard_Sales_Quote/1304/'" w:xpath="/ns0:NavWordReportXmlPart[1]/ns0:Header[1]/ns0:DocumentTitle_Lbl[1]" w:storeItemID="{7E128FEB-D125-49A8-BA06-DC921CECAB22}"/>
+              <w:dataBinding w:prefixMappings="xmlns:ns0='urn:microsoft-dynamics-nav/reports/Standard_Sales_Quote/1304/'" w:xpath="/ns0:NavWordReportXmlPart[1]/ns0:Header[1]/ns0:DocumentTitle_Lbl[1]" w:storeItemID="{12A2964D-3EB4-4B1E-8949-A99CA3D19D26}"/>
               <w:text/>
             </w:sdtPr>
             <w:sdtContent>
@@ -2804,7 +2804,7 @@
               <w:placeholder>
                 <w:docPart w:val="4BE75748E74141829A5BC447504D1AE2"/>
               </w:placeholder>
-              <w:dataBinding w:prefixMappings="xmlns:ns0='urn:microsoft-dynamics-nav/reports/Standard_Sales_Quote/1304/'" w:xpath="/ns0:NavWordReportXmlPart[1]/ns0:Header[1]/ns0:DocumentNo[1]" w:storeItemID="{7E128FEB-D125-49A8-BA06-DC921CECAB22}"/>
+              <w:dataBinding w:prefixMappings="xmlns:ns0='urn:microsoft-dynamics-nav/reports/Standard_Sales_Quote/1304/'" w:xpath="/ns0:NavWordReportXmlPart[1]/ns0:Header[1]/ns0:DocumentNo[1]" w:storeItemID="{12A2964D-3EB4-4B1E-8949-A99CA3D19D26}"/>
               <w:text/>
             </w:sdtPr>
             <w:sdtContent>
@@ -2834,7 +2834,7 @@
               <w:placeholder>
                 <w:docPart w:val="3B86EBAA86EF427F8999CACB0C5F9878"/>
               </w:placeholder>
-              <w:dataBinding w:prefixMappings="xmlns:ns0='urn:microsoft-dynamics-nav/reports/Standard_Sales_Quote/1304/'" w:xpath="/ns0:NavWordReportXmlPart[1]/ns0:Header[1]/ns0:DocumentDate[1]" w:storeItemID="{7E128FEB-D125-49A8-BA06-DC921CECAB22}"/>
+              <w:dataBinding w:prefixMappings="xmlns:ns0='urn:microsoft-dynamics-nav/reports/Standard_Sales_Quote/1304/'" w:xpath="/ns0:NavWordReportXmlPart[1]/ns0:Header[1]/ns0:DocumentDate[1]" w:storeItemID="{12A2964D-3EB4-4B1E-8949-A99CA3D19D26}"/>
               <w:text/>
             </w:sdtPr>
             <w:sdtContent>
@@ -2861,7 +2861,7 @@
               <w:placeholder>
                 <w:docPart w:val="0D1279AEBC2B402F92746D967F36C974"/>
               </w:placeholder>
-              <w:dataBinding w:prefixMappings="xmlns:ns0='urn:microsoft-dynamics-nav/reports/Standard_Sales_Quote/1304/'" w:xpath="/ns0:NavWordReportXmlPart[1]/ns0:Header[1]/ns0:Page_Lbl[1]" w:storeItemID="{7E128FEB-D125-49A8-BA06-DC921CECAB22}"/>
+              <w:dataBinding w:prefixMappings="xmlns:ns0='urn:microsoft-dynamics-nav/reports/Standard_Sales_Quote/1304/'" w:xpath="/ns0:NavWordReportXmlPart[1]/ns0:Header[1]/ns0:Page_Lbl[1]" w:storeItemID="{12A2964D-3EB4-4B1E-8949-A99CA3D19D26}"/>
               <w:text/>
             </w:sdtPr>
             <w:sdtContent>
@@ -2968,7 +2968,7 @@
               <w:alias w:val="#Nav: /Header/CompanyPicture"/>
               <w:tag w:val="#Nav: Standard_Sales_Quote/1304"/>
               <w:id w:val="-1330981123"/>
-              <w:dataBinding w:prefixMappings="xmlns:ns0='urn:microsoft-dynamics-nav/reports/Standard_Sales_Quote/1304/'" w:xpath="/ns0:NavWordReportXmlPart[1]/ns0:Header[1]/ns0:CompanyPicture[1]" w:storeItemID="{7E128FEB-D125-49A8-BA06-DC921CECAB22}"/>
+              <w:dataBinding w:prefixMappings="xmlns:ns0='urn:microsoft-dynamics-nav/reports/Standard_Sales_Quote/1304/'" w:xpath="/ns0:NavWordReportXmlPart[1]/ns0:Header[1]/ns0:CompanyPicture[1]" w:storeItemID="{12A2964D-3EB4-4B1E-8949-A99CA3D19D26}"/>
               <w:picture/>
             </w:sdtPr>
             <w:sdtContent>
@@ -5083,20 +5083,18 @@
   </w:compat>
   <w:rsids>
     <w:rsidRoot w:val="007F0EB0"/>
-    <w:rsid w:val="00110CCB"/>
+    <w:rsid w:val="0018085D"/>
     <w:rsid w:val="002A00F8"/>
     <w:rsid w:val="00391C2E"/>
-    <w:rsid w:val="003B0B65"/>
     <w:rsid w:val="00401A56"/>
     <w:rsid w:val="00401A72"/>
-    <w:rsid w:val="00737DF3"/>
-    <w:rsid w:val="007F0EB0"/>
-    <w:rsid w:val="007F4D81"/>
+    <w:rsid w:val="007F0EB0"/>
     <w:rsid w:val="008139A2"/>
     <w:rsid w:val="008506F4"/>
-    <w:rsid w:val="008F0F46"/>
+    <w:rsid w:val="009B1E50"/>
     <w:rsid w:val="00AA4803"/>
     <w:rsid w:val="00D67D5F"/>
+    <w:rsid w:val="00D811B8"/>
     <w:rsid w:val="00E7673F"/>
     <w:rsid w:val="00ED68E7"/>
     <w:rsid w:val="00EE2183"/>
@@ -6381,7 +6379,7 @@
  
          < C o m p a n y P h o n e N o _ L b l > C o m p a n y P h o n e N o _ L b l < / C o m p a n y P h o n e N o _ L b l >   
-         < C o m p a n y P i c t u r e / > +         < C o m p a n y P i c t u r e > C o m p a n y P i c t u r e < / C o m p a n y P i c t u r e >   
          < C o m p a n y R e g i s t r a t i o n N u m b e r > C o m p a n y R e g i s t r a t i o n N u m b e r < / C o m p a n y R e g i s t r a t i o n N u m b e r >   
@@ -6771,7 +6769,7 @@
 </file>
 
 <file path=customXml/itemProps2.xml><?xml version="1.0" encoding="utf-8"?>
-<ds:datastoreItem xmlns:ds="http://schemas.openxmlformats.org/officeDocument/2006/customXml" ds:itemID="{7E128FEB-D125-49A8-BA06-DC921CECAB22}">
+<ds:datastoreItem xmlns:ds="http://schemas.openxmlformats.org/officeDocument/2006/customXml" ds:itemID="{12A2964D-3EB4-4B1E-8949-A99CA3D19D26}">
   <ds:schemaRefs>
     <ds:schemaRef ds:uri="urn:microsoft-dynamics-nav/reports/Standard_Sales_Quote/1304/"/>
   </ds:schemaRefs>

</xml_diff>